<commit_message>
docs(sads): update traceability, API table and data design to match the build (S-36)
</commit_message>
<xml_diff>
--- a/docs/Software_Architecture_and_Design_Specification.docx
+++ b/docs/Software_Architecture_and_Design_Specification.docx
@@ -1124,7 +1124,7 @@
               <w:rPr>
                 <w:rFonts w:ascii="Calibri" w:eastAsia="Calibri" w:hAnsi="Calibri" w:cs="Calibri"/>
               </w:rPr>
-              <w:t>Computes and credits periodic interest; generates account statements for a selected date range.</w:t>
+              <w:t>Serves balance inquiry and transaction history (FR-9, FR-10), where a Customer sees only the accounts they hold and a Bank Officer any account; computes and credits periodic interest; generates account statements for a selected date range.</w:t>
             </w:r>
           </w:p>
         </w:tc>
@@ -1494,7 +1494,7 @@
               <w:rPr>
                 <w:rFonts w:ascii="Calibri" w:eastAsia="Calibri" w:hAnsi="Calibri" w:cs="Calibri"/>
               </w:rPr>
-              <w:t>FR-6, FR-7, FR-8, NFR-1, NFR-3</w:t>
+              <w:t>FR-6, FR-7, FR-8, NFR-1, NFR-3, NFR-7</w:t>
             </w:r>
           </w:p>
         </w:tc>
@@ -1528,7 +1528,7 @@
               <w:rPr>
                 <w:rFonts w:ascii="Calibri" w:eastAsia="Calibri" w:hAnsi="Calibri" w:cs="Calibri"/>
               </w:rPr>
-              <w:t>FR-11, FR-12</w:t>
+              <w:t>FR-9, FR-10, FR-11, FR-12, NFR-2</w:t>
             </w:r>
           </w:p>
         </w:tc>
@@ -1644,7 +1644,7 @@
               <w:rPr>
                 <w:rFonts w:ascii="Calibri" w:eastAsia="Calibri" w:hAnsi="Calibri" w:cs="Calibri"/>
               </w:rPr>
-              <w:t>FR-1 (RBAC enforcement), NFR-4</w:t>
+              <w:t>FR-1 (RBAC enforcement), NFR-4, NFR-7 (input validation and clear errors)</w:t>
             </w:r>
           </w:p>
         </w:tc>
@@ -1679,6 +1679,74 @@
                 <w:rFonts w:ascii="Calibri" w:eastAsia="Calibri" w:hAnsi="Calibri" w:cs="Calibri"/>
               </w:rPr>
               <w:t>NFR-3 (atomicity), Section 6 (RDBMS requirement)</w:t>
+            </w:r>
+          </w:p>
+        </w:tc>
+      </w:tr>
+      <w:tr>
+        <w:tblPrEx>
+          <w:tblCellMar>
+            <w:top w:w="0" w:type="dxa"/>
+            <w:bottom w:w="0" w:type="dxa"/>
+          </w:tblCellMar>
+        </w:tblPrEx>
+        <w:tc>
+          <w:tcPr>
+            <w:tcW w:w="3200" w:type="dxa"/>
+          </w:tcPr>
+          <w:p>
+            <w:r>
+              <w:rPr>
+                <w:rFonts w:ascii="Calibri" w:eastAsia="Calibri" w:hAnsi="Calibri" w:cs="Calibri"/>
+              </w:rPr>
+              <w:t>Presentation Layer</w:t>
+            </w:r>
+          </w:p>
+        </w:tc>
+        <w:tc>
+          <w:tcPr>
+            <w:tcW w:w="6800" w:type="dxa"/>
+          </w:tcPr>
+          <w:p>
+            <w:r>
+              <w:rPr>
+                <w:rFonts w:ascii="Calibri" w:eastAsia="Calibri" w:hAnsi="Calibri" w:cs="Calibri"/>
+              </w:rPr>
+              <w:t>NFR-2 (page load time), NFR-6 (usability), NFR-9 (Chrome and Firefox without browser-specific code)</w:t>
+            </w:r>
+          </w:p>
+        </w:tc>
+      </w:tr>
+      <w:tr>
+        <w:tblPrEx>
+          <w:tblCellMar>
+            <w:top w:w="0" w:type="dxa"/>
+            <w:bottom w:w="0" w:type="dxa"/>
+          </w:tblCellMar>
+        </w:tblPrEx>
+        <w:tc>
+          <w:tcPr>
+            <w:tcW w:w="3200" w:type="dxa"/>
+          </w:tcPr>
+          <w:p>
+            <w:r>
+              <w:rPr>
+                <w:rFonts w:ascii="Calibri" w:eastAsia="Calibri" w:hAnsi="Calibri" w:cs="Calibri"/>
+              </w:rPr>
+              <w:t>All back-end components</w:t>
+            </w:r>
+          </w:p>
+        </w:tc>
+        <w:tc>
+          <w:tcPr>
+            <w:tcW w:w="6800" w:type="dxa"/>
+          </w:tcPr>
+          <w:p>
+            <w:r>
+              <w:rPr>
+                <w:rFonts w:ascii="Calibri" w:eastAsia="Calibri" w:hAnsi="Calibri" w:cs="Calibri"/>
+              </w:rPr>
+              <w:t>NFR-8 (one module per functional area), NFR-9 (Linux and Windows builds in CI, no platform-specific business logic)</w:t>
             </w:r>
           </w:p>
         </w:tc>
@@ -2137,7 +2205,7 @@
         <w:rPr>
           <w:rFonts w:ascii="Calibri" w:eastAsia="Calibri" w:hAnsi="Calibri" w:cs="Calibri"/>
         </w:rPr>
-        <w:t>This flow shows a Bank Officer initiating a deposit or withdrawal. The Transaction Engine fetches and locks the account row, validates the operation (minimum balance for withdrawals, daily withdrawal limit, account status), applies the balance update and transaction record within a single database transaction, writes an audit log entry, and commits — satisfying the atomicity requirement (NFR-3) and the 2-second performance target (NFR-1).</w:t>
+        <w:t>This flow shows a Bank Officer initiating a deposit or withdrawal. The Transaction Engine takes the database write lock, reads the account, validates the operation (minimum balance for withdrawals, daily withdrawal limit, account status), applies the balance update and transaction record within a single database transaction, writes an audit log entry, and commits — satisfying the atomicity requirement (NFR-3) and the 2-second performance target (NFR-1).</w:t>
       </w:r>
     </w:p>
     <w:p>
@@ -2228,8 +2296,7 @@
         <w:rPr>
           <w:rFonts w:ascii="Calibri" w:eastAsia="Calibri" w:hAnsi="Calibri" w:cs="Calibri"/>
         </w:rPr>
-        <w:lastRenderedPageBreak/>
-        <w:t>This flow shows a fund transfer between two accounts held at the bank. The Transaction Engine rejects same-account transfers immediately, then locks both account rows, validates balance/status on both sides, debits the source, credits the destination, and inserts two linked transaction records sharing a common transfer reference — all within one atomic unit of work. If a failure occurs after the debit but before the credit, a compensating reversal restores the source account, ensuring neither account is left in a partially updated state.</w:t>
+        <w:t>This flow shows a fund transfer between two accounts held at the bank. The Transaction Engine rejects same-account transfers immediately, then, holding the database write lock, reads both accounts and validates balance/status on both sides, debits the source, credits the destination, and inserts two linked transaction records sharing a common transfer reference — all within one atomic unit of work. If a failure occurs after the debit but before the credit, the whole database transaction is rolled back, ensuring neither account is left in a partially updated state.</w:t>
       </w:r>
     </w:p>
     <w:p>
@@ -2253,7 +2320,7 @@
         <w:rPr>
           <w:rFonts w:ascii="Calibri" w:eastAsia="Calibri" w:hAnsi="Calibri" w:cs="Calibri"/>
         </w:rPr>
-        <w:t>The API layer exposes REST-style endpoints over HTTP/HTTPS, exchanging JSON payloads. The table below summarizes the primary endpoints; all endpoints require a valid session token and are subject to RBAC enforcement in the business logic layer.</w:t>
+        <w:t>The API layer exposes REST-style endpoints over HTTP/HTTPS, exchanging JSON payloads. The table below summarizes the primary endpoints; all endpoints require a valid session token and are subject to RBAC enforcement in the business logic layer. Role checks are made in the back-end core as well as in the API layer; a refused request returns 403 and is recorded in the audit trail. No endpoint edits or deletes an audit entry: POST, PUT, PATCH and DELETE on /audit return 405. Rows marked Sprint 2 are specified here and not yet implemented.</w:t>
       </w:r>
     </w:p>
     <w:tbl>
@@ -2444,6 +2511,53 @@
               <w:rPr>
                 <w:rFonts w:ascii="Calibri" w:eastAsia="Calibri" w:hAnsi="Calibri" w:cs="Calibri"/>
               </w:rPr>
+              <w:t>POST /auth/change-password</w:t>
+            </w:r>
+          </w:p>
+        </w:tc>
+        <w:tc>
+          <w:tcPr>
+            <w:tcW w:w="4600" w:type="dxa"/>
+          </w:tcPr>
+          <w:p>
+            <w:r>
+              <w:rPr>
+                <w:rFonts w:ascii="Calibri" w:eastAsia="Calibri" w:hAnsi="Calibri" w:cs="Calibri"/>
+              </w:rPr>
+              <w:t>Set a new password on first sign-in</w:t>
+            </w:r>
+          </w:p>
+        </w:tc>
+        <w:tc>
+          <w:tcPr>
+            <w:tcW w:w="2000" w:type="dxa"/>
+          </w:tcPr>
+          <w:p>
+            <w:r>
+              <w:rPr>
+                <w:rFonts w:ascii="Calibri" w:eastAsia="Calibri" w:hAnsi="Calibri" w:cs="Calibri"/>
+              </w:rPr>
+              <w:t>Any (authenticated)</w:t>
+            </w:r>
+          </w:p>
+        </w:tc>
+      </w:tr>
+      <w:tr>
+        <w:tblPrEx>
+          <w:tblCellMar>
+            <w:top w:w="0" w:type="dxa"/>
+            <w:bottom w:w="0" w:type="dxa"/>
+          </w:tblCellMar>
+        </w:tblPrEx>
+        <w:tc>
+          <w:tcPr>
+            <w:tcW w:w="2600" w:type="dxa"/>
+          </w:tcPr>
+          <w:p>
+            <w:r>
+              <w:rPr>
+                <w:rFonts w:ascii="Calibri" w:eastAsia="Calibri" w:hAnsi="Calibri" w:cs="Calibri"/>
+              </w:rPr>
               <w:t>POST /customers</w:t>
             </w:r>
           </w:p>
@@ -2538,6 +2652,53 @@
               <w:rPr>
                 <w:rFonts w:ascii="Calibri" w:eastAsia="Calibri" w:hAnsi="Calibri" w:cs="Calibri"/>
               </w:rPr>
+              <w:t>GET /customers/{id}/accounts</w:t>
+            </w:r>
+          </w:p>
+        </w:tc>
+        <w:tc>
+          <w:tcPr>
+            <w:tcW w:w="4600" w:type="dxa"/>
+          </w:tcPr>
+          <w:p>
+            <w:r>
+              <w:rPr>
+                <w:rFonts w:ascii="Calibri" w:eastAsia="Calibri" w:hAnsi="Calibri" w:cs="Calibri"/>
+              </w:rPr>
+              <w:t>List the accounts a customer holds, with type, status and balance (Sprint 2)</w:t>
+            </w:r>
+          </w:p>
+        </w:tc>
+        <w:tc>
+          <w:tcPr>
+            <w:tcW w:w="2000" w:type="dxa"/>
+          </w:tcPr>
+          <w:p>
+            <w:r>
+              <w:rPr>
+                <w:rFonts w:ascii="Calibri" w:eastAsia="Calibri" w:hAnsi="Calibri" w:cs="Calibri"/>
+              </w:rPr>
+              <w:t>Officer, Admin, Customer (own)</w:t>
+            </w:r>
+          </w:p>
+        </w:tc>
+      </w:tr>
+      <w:tr>
+        <w:tblPrEx>
+          <w:tblCellMar>
+            <w:top w:w="0" w:type="dxa"/>
+            <w:bottom w:w="0" w:type="dxa"/>
+          </w:tblCellMar>
+        </w:tblPrEx>
+        <w:tc>
+          <w:tcPr>
+            <w:tcW w:w="2600" w:type="dxa"/>
+          </w:tcPr>
+          <w:p>
+            <w:r>
+              <w:rPr>
+                <w:rFonts w:ascii="Calibri" w:eastAsia="Calibri" w:hAnsi="Calibri" w:cs="Calibri"/>
+              </w:rPr>
               <w:t>PUT /customers/{id}</w:t>
             </w:r>
           </w:p>
@@ -2693,6 +2854,104 @@
               <w:rPr>
                 <w:rFonts w:ascii="Calibri" w:eastAsia="Calibri" w:hAnsi="Calibri" w:cs="Calibri"/>
               </w:rPr>
+              <w:t>GET /account-types</w:t>
+            </w:r>
+            <w:proofErr w:type="spellStart"/>
+            <w:proofErr w:type="spellEnd"/>
+          </w:p>
+        </w:tc>
+        <w:tc>
+          <w:tcPr>
+            <w:tcW w:w="4600" w:type="dxa"/>
+          </w:tcPr>
+          <w:p>
+            <w:r>
+              <w:rPr>
+                <w:rFonts w:ascii="Calibri" w:eastAsia="Calibri" w:hAnsi="Calibri" w:cs="Calibri"/>
+              </w:rPr>
+              <w:t>List account types and their parameters (Sprint 2)</w:t>
+            </w:r>
+          </w:p>
+        </w:tc>
+        <w:tc>
+          <w:tcPr>
+            <w:tcW w:w="2000" w:type="dxa"/>
+          </w:tcPr>
+          <w:p>
+            <w:r>
+              <w:rPr>
+                <w:rFonts w:ascii="Calibri" w:eastAsia="Calibri" w:hAnsi="Calibri" w:cs="Calibri"/>
+              </w:rPr>
+              <w:t>Officer, Admin</w:t>
+            </w:r>
+          </w:p>
+        </w:tc>
+      </w:tr>
+      <w:tr>
+        <w:tblPrEx>
+          <w:tblCellMar>
+            <w:top w:w="0" w:type="dxa"/>
+            <w:bottom w:w="0" w:type="dxa"/>
+          </w:tblCellMar>
+        </w:tblPrEx>
+        <w:tc>
+          <w:tcPr>
+            <w:tcW w:w="2600" w:type="dxa"/>
+          </w:tcPr>
+          <w:p>
+            <w:r>
+              <w:rPr>
+                <w:rFonts w:ascii="Calibri" w:eastAsia="Calibri" w:hAnsi="Calibri" w:cs="Calibri"/>
+              </w:rPr>
+              <w:t>POST /account-types, PUT /account-types/{id}</w:t>
+            </w:r>
+            <w:proofErr w:type="spellStart"/>
+            <w:proofErr w:type="spellEnd"/>
+          </w:p>
+        </w:tc>
+        <w:tc>
+          <w:tcPr>
+            <w:tcW w:w="4600" w:type="dxa"/>
+          </w:tcPr>
+          <w:p>
+            <w:r>
+              <w:rPr>
+                <w:rFonts w:ascii="Calibri" w:eastAsia="Calibri" w:hAnsi="Calibri" w:cs="Calibri"/>
+              </w:rPr>
+              <w:t>Create or change an account type and its parameters (Sprint 2)</w:t>
+            </w:r>
+          </w:p>
+        </w:tc>
+        <w:tc>
+          <w:tcPr>
+            <w:tcW w:w="2000" w:type="dxa"/>
+          </w:tcPr>
+          <w:p>
+            <w:r>
+              <w:rPr>
+                <w:rFonts w:ascii="Calibri" w:eastAsia="Calibri" w:hAnsi="Calibri" w:cs="Calibri"/>
+              </w:rPr>
+              <w:t>Admin</w:t>
+            </w:r>
+          </w:p>
+        </w:tc>
+      </w:tr>
+      <w:tr>
+        <w:tblPrEx>
+          <w:tblCellMar>
+            <w:top w:w="0" w:type="dxa"/>
+            <w:bottom w:w="0" w:type="dxa"/>
+          </w:tblCellMar>
+        </w:tblPrEx>
+        <w:tc>
+          <w:tcPr>
+            <w:tcW w:w="2600" w:type="dxa"/>
+          </w:tcPr>
+          <w:p>
+            <w:r>
+              <w:rPr>
+                <w:rFonts w:ascii="Calibri" w:eastAsia="Calibri" w:hAnsi="Calibri" w:cs="Calibri"/>
+              </w:rPr>
               <w:t>POST /transactions</w:t>
             </w:r>
           </w:p>
@@ -2719,7 +2978,7 @@
               <w:rPr>
                 <w:rFonts w:ascii="Calibri" w:eastAsia="Calibri" w:hAnsi="Calibri" w:cs="Calibri"/>
               </w:rPr>
-              <w:t>Officer</w:t>
+              <w:t>Officer, Admin</w:t>
             </w:r>
           </w:p>
         </w:tc>
@@ -2766,7 +3025,7 @@
               <w:rPr>
                 <w:rFonts w:ascii="Calibri" w:eastAsia="Calibri" w:hAnsi="Calibri" w:cs="Calibri"/>
               </w:rPr>
-              <w:t>Officer</w:t>
+              <w:t>Officer, Admin</w:t>
             </w:r>
           </w:p>
         </w:tc>
@@ -3064,6 +3323,53 @@
               <w:rPr>
                 <w:rFonts w:ascii="Calibri" w:eastAsia="Calibri" w:hAnsi="Calibri" w:cs="Calibri"/>
               </w:rPr>
+              <w:t>GET /staff</w:t>
+            </w:r>
+          </w:p>
+        </w:tc>
+        <w:tc>
+          <w:tcPr>
+            <w:tcW w:w="4600" w:type="dxa"/>
+          </w:tcPr>
+          <w:p>
+            <w:r>
+              <w:rPr>
+                <w:rFonts w:ascii="Calibri" w:eastAsia="Calibri" w:hAnsi="Calibri" w:cs="Calibri"/>
+              </w:rPr>
+              <w:t>List Bank Officer accounts</w:t>
+            </w:r>
+          </w:p>
+        </w:tc>
+        <w:tc>
+          <w:tcPr>
+            <w:tcW w:w="2000" w:type="dxa"/>
+          </w:tcPr>
+          <w:p>
+            <w:r>
+              <w:rPr>
+                <w:rFonts w:ascii="Calibri" w:eastAsia="Calibri" w:hAnsi="Calibri" w:cs="Calibri"/>
+              </w:rPr>
+              <w:t>Admin</w:t>
+            </w:r>
+          </w:p>
+        </w:tc>
+      </w:tr>
+      <w:tr>
+        <w:tblPrEx>
+          <w:tblCellMar>
+            <w:top w:w="0" w:type="dxa"/>
+            <w:bottom w:w="0" w:type="dxa"/>
+          </w:tblCellMar>
+        </w:tblPrEx>
+        <w:tc>
+          <w:tcPr>
+            <w:tcW w:w="2600" w:type="dxa"/>
+          </w:tcPr>
+          <w:p>
+            <w:r>
+              <w:rPr>
+                <w:rFonts w:ascii="Calibri" w:eastAsia="Calibri" w:hAnsi="Calibri" w:cs="Calibri"/>
+              </w:rPr>
               <w:t>PATCH /staff/{id}</w:t>
             </w:r>
           </w:p>
@@ -3077,7 +3383,148 @@
               <w:rPr>
                 <w:rFonts w:ascii="Calibri" w:eastAsia="Calibri" w:hAnsi="Calibri" w:cs="Calibri"/>
               </w:rPr>
-              <w:t>Update / deactivate / unlock a staff account</w:t>
+              <w:t>Rename, deactivate or reactivate a Bank Officer account</w:t>
+            </w:r>
+          </w:p>
+        </w:tc>
+        <w:tc>
+          <w:tcPr>
+            <w:tcW w:w="2000" w:type="dxa"/>
+          </w:tcPr>
+          <w:p>
+            <w:r>
+              <w:rPr>
+                <w:rFonts w:ascii="Calibri" w:eastAsia="Calibri" w:hAnsi="Calibri" w:cs="Calibri"/>
+              </w:rPr>
+              <w:t>Admin</w:t>
+            </w:r>
+          </w:p>
+        </w:tc>
+      </w:tr>
+      <w:tr>
+        <w:tblPrEx>
+          <w:tblCellMar>
+            <w:top w:w="0" w:type="dxa"/>
+            <w:bottom w:w="0" w:type="dxa"/>
+          </w:tblCellMar>
+        </w:tblPrEx>
+        <w:tc>
+          <w:tcPr>
+            <w:tcW w:w="2600" w:type="dxa"/>
+          </w:tcPr>
+          <w:p>
+            <w:r>
+              <w:rPr>
+                <w:rFonts w:ascii="Calibri" w:eastAsia="Calibri" w:hAnsi="Calibri" w:cs="Calibri"/>
+              </w:rPr>
+              <w:t>GET /users/locked</w:t>
+            </w:r>
+          </w:p>
+        </w:tc>
+        <w:tc>
+          <w:tcPr>
+            <w:tcW w:w="4600" w:type="dxa"/>
+          </w:tcPr>
+          <w:p>
+            <w:r>
+              <w:rPr>
+                <w:rFonts w:ascii="Calibri" w:eastAsia="Calibri" w:hAnsi="Calibri" w:cs="Calibri"/>
+              </w:rPr>
+              <w:t>List users locked after three failed sign-ins</w:t>
+            </w:r>
+          </w:p>
+        </w:tc>
+        <w:tc>
+          <w:tcPr>
+            <w:tcW w:w="2000" w:type="dxa"/>
+          </w:tcPr>
+          <w:p>
+            <w:r>
+              <w:rPr>
+                <w:rFonts w:ascii="Calibri" w:eastAsia="Calibri" w:hAnsi="Calibri" w:cs="Calibri"/>
+              </w:rPr>
+              <w:t>Admin</w:t>
+            </w:r>
+          </w:p>
+        </w:tc>
+      </w:tr>
+      <w:tr>
+        <w:tblPrEx>
+          <w:tblCellMar>
+            <w:top w:w="0" w:type="dxa"/>
+            <w:bottom w:w="0" w:type="dxa"/>
+          </w:tblCellMar>
+        </w:tblPrEx>
+        <w:tc>
+          <w:tcPr>
+            <w:tcW w:w="2600" w:type="dxa"/>
+          </w:tcPr>
+          <w:p>
+            <w:r>
+              <w:rPr>
+                <w:rFonts w:ascii="Calibri" w:eastAsia="Calibri" w:hAnsi="Calibri" w:cs="Calibri"/>
+              </w:rPr>
+              <w:t>PATCH /users/{id}/unlock</w:t>
+            </w:r>
+          </w:p>
+        </w:tc>
+        <w:tc>
+          <w:tcPr>
+            <w:tcW w:w="4600" w:type="dxa"/>
+          </w:tcPr>
+          <w:p>
+            <w:r>
+              <w:rPr>
+                <w:rFonts w:ascii="Calibri" w:eastAsia="Calibri" w:hAnsi="Calibri" w:cs="Calibri"/>
+              </w:rPr>
+              <w:t>Unlock a locked user (customer or staff) and reset the failure count</w:t>
+            </w:r>
+          </w:p>
+        </w:tc>
+        <w:tc>
+          <w:tcPr>
+            <w:tcW w:w="2000" w:type="dxa"/>
+          </w:tcPr>
+          <w:p>
+            <w:r>
+              <w:rPr>
+                <w:rFonts w:ascii="Calibri" w:eastAsia="Calibri" w:hAnsi="Calibri" w:cs="Calibri"/>
+              </w:rPr>
+              <w:t>Admin</w:t>
+            </w:r>
+          </w:p>
+        </w:tc>
+      </w:tr>
+      <w:tr>
+        <w:tblPrEx>
+          <w:tblCellMar>
+            <w:top w:w="0" w:type="dxa"/>
+            <w:bottom w:w="0" w:type="dxa"/>
+          </w:tblCellMar>
+        </w:tblPrEx>
+        <w:tc>
+          <w:tcPr>
+            <w:tcW w:w="2600" w:type="dxa"/>
+          </w:tcPr>
+          <w:p>
+            <w:r>
+              <w:rPr>
+                <w:rFonts w:ascii="Calibri" w:eastAsia="Calibri" w:hAnsi="Calibri" w:cs="Calibri"/>
+              </w:rPr>
+              <w:t>GET /audit</w:t>
+            </w:r>
+          </w:p>
+        </w:tc>
+        <w:tc>
+          <w:tcPr>
+            <w:tcW w:w="4600" w:type="dxa"/>
+          </w:tcPr>
+          <w:p>
+            <w:r>
+              <w:rPr>
+                <w:rFonts w:ascii="Calibri" w:eastAsia="Calibri" w:hAnsi="Calibri" w:cs="Calibri"/>
+              </w:rPr>
+              <w:t>Browse the audit trail, newest first, filtered by date range and account; read-only</w:t>
             </w:r>
           </w:p>
         </w:tc>
@@ -3249,7 +3696,7 @@
         <w:rPr>
           <w:rFonts w:ascii="Calibri" w:eastAsia="Calibri" w:hAnsi="Calibri" w:cs="Calibri"/>
         </w:rPr>
-        <w:t>Concurrency conflicts (e.g., two operations on the same account) are handled via row-level locking at the database layer; a losing transaction is retried or rejected with a clear message rather than silently overwriting data.</w:t>
+        <w:t>Concurrency conflicts (e.g., two operations on the same account) are handled by the database write lock. The chosen RDBMS, SQLite (ADR 001), has no row-level locking, so every balance-changing operation starts with BEGIN IMMEDIATE and writes run one at a time; the second request then reads the updated balance and either succeeds or is rejected with a clear message, and no update is lost. The row locks drawn in Figures 2 and 3 are realised by this database-wide lock. Record-level locking is future work (SRS Appendix D); see the deviations log.</w:t>
       </w:r>
     </w:p>
     <w:tbl>
@@ -3514,7 +3961,7 @@
               <w:rPr>
                 <w:rFonts w:ascii="Calibri" w:eastAsia="Calibri" w:hAnsi="Calibri" w:cs="Calibri"/>
               </w:rPr>
-              <w:t>Row-level lock serializes operations; second request processed against updated balance or rejected if now invalid</w:t>
+              <w:t>Database write lock serializes operations; second request processed against updated balance or rejected if now invalid</w:t>
             </w:r>
           </w:p>
         </w:tc>
@@ -3650,6 +4097,78 @@
           <w:rFonts w:ascii="Calibri" w:eastAsia="Calibri" w:hAnsi="Calibri" w:cs="Calibri"/>
         </w:rPr>
         <w:t>) Transaction. Referential integrity constraints (foreign keys) enforce these relationships, and database-level transactions provide the atomicity guarantees required by NFR-3. Full attribute lists, primary/foreign keys, and cardinalities are maintained in the project repository's design/ directory, consistent with SRS Appendix B.</w:t>
+      </w:r>
+    </w:p>
+    <w:p>
+      <w:pPr>
+        <w:spacing w:after="120"/>
+      </w:pPr>
+      <w:r>
+        <w:t xml:space="preserve">The entity-relationship diagram of the implemented schema is Figure 4 and is kept in the repository as </w:t>
+      </w:r>
+      <w:hyperlink r:id="rId10">
+        <w:r>
+          <w:rPr>
+            <w:u w:val="single"/>
+            <w:color w:val="0563C1"/>
+          </w:rPr>
+          <w:t>design/er-diagram.png</w:t>
+        </w:r>
+      </w:hyperlink>
+      <w:r>
+        <w:t xml:space="preserve"> (Mermaid source design/er-diagram.mmd, SVG design/er-diagram.svg). It adds the users table (role, status, failed-attempt count), the append-only audit_log table, the interest_runs table and the account type parameters to the entities listed above; audit_log and transactions are made append-only by database triggers.</w:t>
+      </w:r>
+    </w:p>
+    <w:p>
+      <w:pPr>
+        <w:spacing w:after="200"/>
+        <w:jc w:val="center"/>
+      </w:pPr>
+      <w:r>
+        <w:drawing>
+          <wp:inline xmlns:a="http://schemas.openxmlformats.org/drawingml/2006/main" xmlns:pic="http://schemas.openxmlformats.org/drawingml/2006/picture">
+            <wp:extent cx="2509721" cy="5669280"/>
+            <wp:docPr id="2020846634" name="Picture 2020846634"/>
+            <wp:cNvGraphicFramePr>
+              <a:graphicFrameLocks noChangeAspect="1"/>
+            </wp:cNvGraphicFramePr>
+            <a:graphic>
+              <a:graphicData uri="http://schemas.openxmlformats.org/drawingml/2006/picture">
+                <pic:pic>
+                  <pic:nvPicPr>
+                    <pic:cNvPr id="0" name="er-diagram.png"/>
+                    <pic:cNvPicPr/>
+                  </pic:nvPicPr>
+                  <pic:blipFill>
+                    <a:blip r:embed="rId11"/>
+                    <a:stretch>
+                      <a:fillRect/>
+                    </a:stretch>
+                  </pic:blipFill>
+                  <pic:spPr>
+                    <a:xfrm>
+                      <a:off x="0" y="0"/>
+                      <a:ext cx="2509721" cy="5669280"/>
+                    </a:xfrm>
+                    <a:prstGeom prst="rect"/>
+                  </pic:spPr>
+                </pic:pic>
+              </a:graphicData>
+            </a:graphic>
+          </wp:inline>
+        </w:drawing>
+      </w:r>
+    </w:p>
+    <w:p>
+      <w:pPr>
+        <w:spacing w:after="300"/>
+        <w:jc w:val="center"/>
+      </w:pPr>
+      <w:r>
+        <w:rPr>
+          <w:i/>
+        </w:rPr>
+        <w:t>Figure 4: Entity-Relationship Diagram — Bank Management System database</w:t>
       </w:r>
     </w:p>
     <w:p>

</xml_diff>

<commit_message>
docs(sads): update traceability, API table and data design to match the build (S-36) (#95)
</commit_message>
<xml_diff>
--- a/docs/Software_Architecture_and_Design_Specification.docx
+++ b/docs/Software_Architecture_and_Design_Specification.docx
@@ -1124,7 +1124,7 @@
               <w:rPr>
                 <w:rFonts w:ascii="Calibri" w:eastAsia="Calibri" w:hAnsi="Calibri" w:cs="Calibri"/>
               </w:rPr>
-              <w:t>Computes and credits periodic interest; generates account statements for a selected date range.</w:t>
+              <w:t>Serves balance inquiry and transaction history (FR-9, FR-10), where a Customer sees only the accounts they hold and a Bank Officer any account; computes and credits periodic interest; generates account statements for a selected date range.</w:t>
             </w:r>
           </w:p>
         </w:tc>
@@ -1494,7 +1494,7 @@
               <w:rPr>
                 <w:rFonts w:ascii="Calibri" w:eastAsia="Calibri" w:hAnsi="Calibri" w:cs="Calibri"/>
               </w:rPr>
-              <w:t>FR-6, FR-7, FR-8, NFR-1, NFR-3</w:t>
+              <w:t>FR-6, FR-7, FR-8, NFR-1, NFR-3, NFR-7</w:t>
             </w:r>
           </w:p>
         </w:tc>
@@ -1528,7 +1528,7 @@
               <w:rPr>
                 <w:rFonts w:ascii="Calibri" w:eastAsia="Calibri" w:hAnsi="Calibri" w:cs="Calibri"/>
               </w:rPr>
-              <w:t>FR-11, FR-12</w:t>
+              <w:t>FR-9, FR-10, FR-11, FR-12, NFR-2</w:t>
             </w:r>
           </w:p>
         </w:tc>
@@ -1644,7 +1644,7 @@
               <w:rPr>
                 <w:rFonts w:ascii="Calibri" w:eastAsia="Calibri" w:hAnsi="Calibri" w:cs="Calibri"/>
               </w:rPr>
-              <w:t>FR-1 (RBAC enforcement), NFR-4</w:t>
+              <w:t>FR-1 (RBAC enforcement), NFR-4, NFR-7 (input validation and clear errors)</w:t>
             </w:r>
           </w:p>
         </w:tc>
@@ -1679,6 +1679,74 @@
                 <w:rFonts w:ascii="Calibri" w:eastAsia="Calibri" w:hAnsi="Calibri" w:cs="Calibri"/>
               </w:rPr>
               <w:t>NFR-3 (atomicity), Section 6 (RDBMS requirement)</w:t>
+            </w:r>
+          </w:p>
+        </w:tc>
+      </w:tr>
+      <w:tr>
+        <w:tblPrEx>
+          <w:tblCellMar>
+            <w:top w:w="0" w:type="dxa"/>
+            <w:bottom w:w="0" w:type="dxa"/>
+          </w:tblCellMar>
+        </w:tblPrEx>
+        <w:tc>
+          <w:tcPr>
+            <w:tcW w:w="3200" w:type="dxa"/>
+          </w:tcPr>
+          <w:p>
+            <w:r>
+              <w:rPr>
+                <w:rFonts w:ascii="Calibri" w:eastAsia="Calibri" w:hAnsi="Calibri" w:cs="Calibri"/>
+              </w:rPr>
+              <w:t>Presentation Layer</w:t>
+            </w:r>
+          </w:p>
+        </w:tc>
+        <w:tc>
+          <w:tcPr>
+            <w:tcW w:w="6800" w:type="dxa"/>
+          </w:tcPr>
+          <w:p>
+            <w:r>
+              <w:rPr>
+                <w:rFonts w:ascii="Calibri" w:eastAsia="Calibri" w:hAnsi="Calibri" w:cs="Calibri"/>
+              </w:rPr>
+              <w:t>NFR-2 (page load time), NFR-6 (usability), NFR-9 (Chrome and Firefox without browser-specific code)</w:t>
+            </w:r>
+          </w:p>
+        </w:tc>
+      </w:tr>
+      <w:tr>
+        <w:tblPrEx>
+          <w:tblCellMar>
+            <w:top w:w="0" w:type="dxa"/>
+            <w:bottom w:w="0" w:type="dxa"/>
+          </w:tblCellMar>
+        </w:tblPrEx>
+        <w:tc>
+          <w:tcPr>
+            <w:tcW w:w="3200" w:type="dxa"/>
+          </w:tcPr>
+          <w:p>
+            <w:r>
+              <w:rPr>
+                <w:rFonts w:ascii="Calibri" w:eastAsia="Calibri" w:hAnsi="Calibri" w:cs="Calibri"/>
+              </w:rPr>
+              <w:t>All back-end components</w:t>
+            </w:r>
+          </w:p>
+        </w:tc>
+        <w:tc>
+          <w:tcPr>
+            <w:tcW w:w="6800" w:type="dxa"/>
+          </w:tcPr>
+          <w:p>
+            <w:r>
+              <w:rPr>
+                <w:rFonts w:ascii="Calibri" w:eastAsia="Calibri" w:hAnsi="Calibri" w:cs="Calibri"/>
+              </w:rPr>
+              <w:t>NFR-8 (one module per functional area), NFR-9 (Linux and Windows builds in CI, no platform-specific business logic)</w:t>
             </w:r>
           </w:p>
         </w:tc>
@@ -2137,7 +2205,7 @@
         <w:rPr>
           <w:rFonts w:ascii="Calibri" w:eastAsia="Calibri" w:hAnsi="Calibri" w:cs="Calibri"/>
         </w:rPr>
-        <w:t>This flow shows a Bank Officer initiating a deposit or withdrawal. The Transaction Engine fetches and locks the account row, validates the operation (minimum balance for withdrawals, daily withdrawal limit, account status), applies the balance update and transaction record within a single database transaction, writes an audit log entry, and commits — satisfying the atomicity requirement (NFR-3) and the 2-second performance target (NFR-1).</w:t>
+        <w:t>This flow shows a Bank Officer initiating a deposit or withdrawal. The Transaction Engine takes the database write lock, reads the account, validates the operation (minimum balance for withdrawals, daily withdrawal limit, account status), applies the balance update and transaction record within a single database transaction, writes an audit log entry, and commits — satisfying the atomicity requirement (NFR-3) and the 2-second performance target (NFR-1).</w:t>
       </w:r>
     </w:p>
     <w:p>
@@ -2228,8 +2296,7 @@
         <w:rPr>
           <w:rFonts w:ascii="Calibri" w:eastAsia="Calibri" w:hAnsi="Calibri" w:cs="Calibri"/>
         </w:rPr>
-        <w:lastRenderedPageBreak/>
-        <w:t>This flow shows a fund transfer between two accounts held at the bank. The Transaction Engine rejects same-account transfers immediately, then locks both account rows, validates balance/status on both sides, debits the source, credits the destination, and inserts two linked transaction records sharing a common transfer reference — all within one atomic unit of work. If a failure occurs after the debit but before the credit, a compensating reversal restores the source account, ensuring neither account is left in a partially updated state.</w:t>
+        <w:t>This flow shows a fund transfer between two accounts held at the bank. The Transaction Engine rejects same-account transfers immediately, then, holding the database write lock, reads both accounts and validates balance/status on both sides, debits the source, credits the destination, and inserts two linked transaction records sharing a common transfer reference — all within one atomic unit of work. If a failure occurs after the debit but before the credit, the whole database transaction is rolled back, ensuring neither account is left in a partially updated state.</w:t>
       </w:r>
     </w:p>
     <w:p>
@@ -2253,7 +2320,7 @@
         <w:rPr>
           <w:rFonts w:ascii="Calibri" w:eastAsia="Calibri" w:hAnsi="Calibri" w:cs="Calibri"/>
         </w:rPr>
-        <w:t>The API layer exposes REST-style endpoints over HTTP/HTTPS, exchanging JSON payloads. The table below summarizes the primary endpoints; all endpoints require a valid session token and are subject to RBAC enforcement in the business logic layer.</w:t>
+        <w:t>The API layer exposes REST-style endpoints over HTTP/HTTPS, exchanging JSON payloads. The table below summarizes the primary endpoints; all endpoints require a valid session token and are subject to RBAC enforcement in the business logic layer. Role checks are made in the back-end core as well as in the API layer; a refused request returns 403 and is recorded in the audit trail. No endpoint edits or deletes an audit entry: POST, PUT, PATCH and DELETE on /audit return 405. Rows marked Sprint 2 are specified here and not yet implemented.</w:t>
       </w:r>
     </w:p>
     <w:tbl>
@@ -2444,6 +2511,53 @@
               <w:rPr>
                 <w:rFonts w:ascii="Calibri" w:eastAsia="Calibri" w:hAnsi="Calibri" w:cs="Calibri"/>
               </w:rPr>
+              <w:t>POST /auth/change-password</w:t>
+            </w:r>
+          </w:p>
+        </w:tc>
+        <w:tc>
+          <w:tcPr>
+            <w:tcW w:w="4600" w:type="dxa"/>
+          </w:tcPr>
+          <w:p>
+            <w:r>
+              <w:rPr>
+                <w:rFonts w:ascii="Calibri" w:eastAsia="Calibri" w:hAnsi="Calibri" w:cs="Calibri"/>
+              </w:rPr>
+              <w:t>Set a new password on first sign-in</w:t>
+            </w:r>
+          </w:p>
+        </w:tc>
+        <w:tc>
+          <w:tcPr>
+            <w:tcW w:w="2000" w:type="dxa"/>
+          </w:tcPr>
+          <w:p>
+            <w:r>
+              <w:rPr>
+                <w:rFonts w:ascii="Calibri" w:eastAsia="Calibri" w:hAnsi="Calibri" w:cs="Calibri"/>
+              </w:rPr>
+              <w:t>Any (authenticated)</w:t>
+            </w:r>
+          </w:p>
+        </w:tc>
+      </w:tr>
+      <w:tr>
+        <w:tblPrEx>
+          <w:tblCellMar>
+            <w:top w:w="0" w:type="dxa"/>
+            <w:bottom w:w="0" w:type="dxa"/>
+          </w:tblCellMar>
+        </w:tblPrEx>
+        <w:tc>
+          <w:tcPr>
+            <w:tcW w:w="2600" w:type="dxa"/>
+          </w:tcPr>
+          <w:p>
+            <w:r>
+              <w:rPr>
+                <w:rFonts w:ascii="Calibri" w:eastAsia="Calibri" w:hAnsi="Calibri" w:cs="Calibri"/>
+              </w:rPr>
               <w:t>POST /customers</w:t>
             </w:r>
           </w:p>
@@ -2538,6 +2652,53 @@
               <w:rPr>
                 <w:rFonts w:ascii="Calibri" w:eastAsia="Calibri" w:hAnsi="Calibri" w:cs="Calibri"/>
               </w:rPr>
+              <w:t>GET /customers/{id}/accounts</w:t>
+            </w:r>
+          </w:p>
+        </w:tc>
+        <w:tc>
+          <w:tcPr>
+            <w:tcW w:w="4600" w:type="dxa"/>
+          </w:tcPr>
+          <w:p>
+            <w:r>
+              <w:rPr>
+                <w:rFonts w:ascii="Calibri" w:eastAsia="Calibri" w:hAnsi="Calibri" w:cs="Calibri"/>
+              </w:rPr>
+              <w:t>List the accounts a customer holds, with type, status and balance (Sprint 2)</w:t>
+            </w:r>
+          </w:p>
+        </w:tc>
+        <w:tc>
+          <w:tcPr>
+            <w:tcW w:w="2000" w:type="dxa"/>
+          </w:tcPr>
+          <w:p>
+            <w:r>
+              <w:rPr>
+                <w:rFonts w:ascii="Calibri" w:eastAsia="Calibri" w:hAnsi="Calibri" w:cs="Calibri"/>
+              </w:rPr>
+              <w:t>Officer, Admin, Customer (own)</w:t>
+            </w:r>
+          </w:p>
+        </w:tc>
+      </w:tr>
+      <w:tr>
+        <w:tblPrEx>
+          <w:tblCellMar>
+            <w:top w:w="0" w:type="dxa"/>
+            <w:bottom w:w="0" w:type="dxa"/>
+          </w:tblCellMar>
+        </w:tblPrEx>
+        <w:tc>
+          <w:tcPr>
+            <w:tcW w:w="2600" w:type="dxa"/>
+          </w:tcPr>
+          <w:p>
+            <w:r>
+              <w:rPr>
+                <w:rFonts w:ascii="Calibri" w:eastAsia="Calibri" w:hAnsi="Calibri" w:cs="Calibri"/>
+              </w:rPr>
               <w:t>PUT /customers/{id}</w:t>
             </w:r>
           </w:p>
@@ -2693,6 +2854,104 @@
               <w:rPr>
                 <w:rFonts w:ascii="Calibri" w:eastAsia="Calibri" w:hAnsi="Calibri" w:cs="Calibri"/>
               </w:rPr>
+              <w:t>GET /account-types</w:t>
+            </w:r>
+            <w:proofErr w:type="spellStart"/>
+            <w:proofErr w:type="spellEnd"/>
+          </w:p>
+        </w:tc>
+        <w:tc>
+          <w:tcPr>
+            <w:tcW w:w="4600" w:type="dxa"/>
+          </w:tcPr>
+          <w:p>
+            <w:r>
+              <w:rPr>
+                <w:rFonts w:ascii="Calibri" w:eastAsia="Calibri" w:hAnsi="Calibri" w:cs="Calibri"/>
+              </w:rPr>
+              <w:t>List account types and their parameters (Sprint 2)</w:t>
+            </w:r>
+          </w:p>
+        </w:tc>
+        <w:tc>
+          <w:tcPr>
+            <w:tcW w:w="2000" w:type="dxa"/>
+          </w:tcPr>
+          <w:p>
+            <w:r>
+              <w:rPr>
+                <w:rFonts w:ascii="Calibri" w:eastAsia="Calibri" w:hAnsi="Calibri" w:cs="Calibri"/>
+              </w:rPr>
+              <w:t>Officer, Admin</w:t>
+            </w:r>
+          </w:p>
+        </w:tc>
+      </w:tr>
+      <w:tr>
+        <w:tblPrEx>
+          <w:tblCellMar>
+            <w:top w:w="0" w:type="dxa"/>
+            <w:bottom w:w="0" w:type="dxa"/>
+          </w:tblCellMar>
+        </w:tblPrEx>
+        <w:tc>
+          <w:tcPr>
+            <w:tcW w:w="2600" w:type="dxa"/>
+          </w:tcPr>
+          <w:p>
+            <w:r>
+              <w:rPr>
+                <w:rFonts w:ascii="Calibri" w:eastAsia="Calibri" w:hAnsi="Calibri" w:cs="Calibri"/>
+              </w:rPr>
+              <w:t>POST /account-types, PUT /account-types/{id}</w:t>
+            </w:r>
+            <w:proofErr w:type="spellStart"/>
+            <w:proofErr w:type="spellEnd"/>
+          </w:p>
+        </w:tc>
+        <w:tc>
+          <w:tcPr>
+            <w:tcW w:w="4600" w:type="dxa"/>
+          </w:tcPr>
+          <w:p>
+            <w:r>
+              <w:rPr>
+                <w:rFonts w:ascii="Calibri" w:eastAsia="Calibri" w:hAnsi="Calibri" w:cs="Calibri"/>
+              </w:rPr>
+              <w:t>Create or change an account type and its parameters (Sprint 2)</w:t>
+            </w:r>
+          </w:p>
+        </w:tc>
+        <w:tc>
+          <w:tcPr>
+            <w:tcW w:w="2000" w:type="dxa"/>
+          </w:tcPr>
+          <w:p>
+            <w:r>
+              <w:rPr>
+                <w:rFonts w:ascii="Calibri" w:eastAsia="Calibri" w:hAnsi="Calibri" w:cs="Calibri"/>
+              </w:rPr>
+              <w:t>Admin</w:t>
+            </w:r>
+          </w:p>
+        </w:tc>
+      </w:tr>
+      <w:tr>
+        <w:tblPrEx>
+          <w:tblCellMar>
+            <w:top w:w="0" w:type="dxa"/>
+            <w:bottom w:w="0" w:type="dxa"/>
+          </w:tblCellMar>
+        </w:tblPrEx>
+        <w:tc>
+          <w:tcPr>
+            <w:tcW w:w="2600" w:type="dxa"/>
+          </w:tcPr>
+          <w:p>
+            <w:r>
+              <w:rPr>
+                <w:rFonts w:ascii="Calibri" w:eastAsia="Calibri" w:hAnsi="Calibri" w:cs="Calibri"/>
+              </w:rPr>
               <w:t>POST /transactions</w:t>
             </w:r>
           </w:p>
@@ -2719,7 +2978,7 @@
               <w:rPr>
                 <w:rFonts w:ascii="Calibri" w:eastAsia="Calibri" w:hAnsi="Calibri" w:cs="Calibri"/>
               </w:rPr>
-              <w:t>Officer</w:t>
+              <w:t>Officer, Admin</w:t>
             </w:r>
           </w:p>
         </w:tc>
@@ -2766,7 +3025,7 @@
               <w:rPr>
                 <w:rFonts w:ascii="Calibri" w:eastAsia="Calibri" w:hAnsi="Calibri" w:cs="Calibri"/>
               </w:rPr>
-              <w:t>Officer</w:t>
+              <w:t>Officer, Admin</w:t>
             </w:r>
           </w:p>
         </w:tc>
@@ -3064,6 +3323,53 @@
               <w:rPr>
                 <w:rFonts w:ascii="Calibri" w:eastAsia="Calibri" w:hAnsi="Calibri" w:cs="Calibri"/>
               </w:rPr>
+              <w:t>GET /staff</w:t>
+            </w:r>
+          </w:p>
+        </w:tc>
+        <w:tc>
+          <w:tcPr>
+            <w:tcW w:w="4600" w:type="dxa"/>
+          </w:tcPr>
+          <w:p>
+            <w:r>
+              <w:rPr>
+                <w:rFonts w:ascii="Calibri" w:eastAsia="Calibri" w:hAnsi="Calibri" w:cs="Calibri"/>
+              </w:rPr>
+              <w:t>List Bank Officer accounts</w:t>
+            </w:r>
+          </w:p>
+        </w:tc>
+        <w:tc>
+          <w:tcPr>
+            <w:tcW w:w="2000" w:type="dxa"/>
+          </w:tcPr>
+          <w:p>
+            <w:r>
+              <w:rPr>
+                <w:rFonts w:ascii="Calibri" w:eastAsia="Calibri" w:hAnsi="Calibri" w:cs="Calibri"/>
+              </w:rPr>
+              <w:t>Admin</w:t>
+            </w:r>
+          </w:p>
+        </w:tc>
+      </w:tr>
+      <w:tr>
+        <w:tblPrEx>
+          <w:tblCellMar>
+            <w:top w:w="0" w:type="dxa"/>
+            <w:bottom w:w="0" w:type="dxa"/>
+          </w:tblCellMar>
+        </w:tblPrEx>
+        <w:tc>
+          <w:tcPr>
+            <w:tcW w:w="2600" w:type="dxa"/>
+          </w:tcPr>
+          <w:p>
+            <w:r>
+              <w:rPr>
+                <w:rFonts w:ascii="Calibri" w:eastAsia="Calibri" w:hAnsi="Calibri" w:cs="Calibri"/>
+              </w:rPr>
               <w:t>PATCH /staff/{id}</w:t>
             </w:r>
           </w:p>
@@ -3077,7 +3383,148 @@
               <w:rPr>
                 <w:rFonts w:ascii="Calibri" w:eastAsia="Calibri" w:hAnsi="Calibri" w:cs="Calibri"/>
               </w:rPr>
-              <w:t>Update / deactivate / unlock a staff account</w:t>
+              <w:t>Rename, deactivate or reactivate a Bank Officer account</w:t>
+            </w:r>
+          </w:p>
+        </w:tc>
+        <w:tc>
+          <w:tcPr>
+            <w:tcW w:w="2000" w:type="dxa"/>
+          </w:tcPr>
+          <w:p>
+            <w:r>
+              <w:rPr>
+                <w:rFonts w:ascii="Calibri" w:eastAsia="Calibri" w:hAnsi="Calibri" w:cs="Calibri"/>
+              </w:rPr>
+              <w:t>Admin</w:t>
+            </w:r>
+          </w:p>
+        </w:tc>
+      </w:tr>
+      <w:tr>
+        <w:tblPrEx>
+          <w:tblCellMar>
+            <w:top w:w="0" w:type="dxa"/>
+            <w:bottom w:w="0" w:type="dxa"/>
+          </w:tblCellMar>
+        </w:tblPrEx>
+        <w:tc>
+          <w:tcPr>
+            <w:tcW w:w="2600" w:type="dxa"/>
+          </w:tcPr>
+          <w:p>
+            <w:r>
+              <w:rPr>
+                <w:rFonts w:ascii="Calibri" w:eastAsia="Calibri" w:hAnsi="Calibri" w:cs="Calibri"/>
+              </w:rPr>
+              <w:t>GET /users/locked</w:t>
+            </w:r>
+          </w:p>
+        </w:tc>
+        <w:tc>
+          <w:tcPr>
+            <w:tcW w:w="4600" w:type="dxa"/>
+          </w:tcPr>
+          <w:p>
+            <w:r>
+              <w:rPr>
+                <w:rFonts w:ascii="Calibri" w:eastAsia="Calibri" w:hAnsi="Calibri" w:cs="Calibri"/>
+              </w:rPr>
+              <w:t>List users locked after three failed sign-ins</w:t>
+            </w:r>
+          </w:p>
+        </w:tc>
+        <w:tc>
+          <w:tcPr>
+            <w:tcW w:w="2000" w:type="dxa"/>
+          </w:tcPr>
+          <w:p>
+            <w:r>
+              <w:rPr>
+                <w:rFonts w:ascii="Calibri" w:eastAsia="Calibri" w:hAnsi="Calibri" w:cs="Calibri"/>
+              </w:rPr>
+              <w:t>Admin</w:t>
+            </w:r>
+          </w:p>
+        </w:tc>
+      </w:tr>
+      <w:tr>
+        <w:tblPrEx>
+          <w:tblCellMar>
+            <w:top w:w="0" w:type="dxa"/>
+            <w:bottom w:w="0" w:type="dxa"/>
+          </w:tblCellMar>
+        </w:tblPrEx>
+        <w:tc>
+          <w:tcPr>
+            <w:tcW w:w="2600" w:type="dxa"/>
+          </w:tcPr>
+          <w:p>
+            <w:r>
+              <w:rPr>
+                <w:rFonts w:ascii="Calibri" w:eastAsia="Calibri" w:hAnsi="Calibri" w:cs="Calibri"/>
+              </w:rPr>
+              <w:t>PATCH /users/{id}/unlock</w:t>
+            </w:r>
+          </w:p>
+        </w:tc>
+        <w:tc>
+          <w:tcPr>
+            <w:tcW w:w="4600" w:type="dxa"/>
+          </w:tcPr>
+          <w:p>
+            <w:r>
+              <w:rPr>
+                <w:rFonts w:ascii="Calibri" w:eastAsia="Calibri" w:hAnsi="Calibri" w:cs="Calibri"/>
+              </w:rPr>
+              <w:t>Unlock a locked user (customer or staff) and reset the failure count</w:t>
+            </w:r>
+          </w:p>
+        </w:tc>
+        <w:tc>
+          <w:tcPr>
+            <w:tcW w:w="2000" w:type="dxa"/>
+          </w:tcPr>
+          <w:p>
+            <w:r>
+              <w:rPr>
+                <w:rFonts w:ascii="Calibri" w:eastAsia="Calibri" w:hAnsi="Calibri" w:cs="Calibri"/>
+              </w:rPr>
+              <w:t>Admin</w:t>
+            </w:r>
+          </w:p>
+        </w:tc>
+      </w:tr>
+      <w:tr>
+        <w:tblPrEx>
+          <w:tblCellMar>
+            <w:top w:w="0" w:type="dxa"/>
+            <w:bottom w:w="0" w:type="dxa"/>
+          </w:tblCellMar>
+        </w:tblPrEx>
+        <w:tc>
+          <w:tcPr>
+            <w:tcW w:w="2600" w:type="dxa"/>
+          </w:tcPr>
+          <w:p>
+            <w:r>
+              <w:rPr>
+                <w:rFonts w:ascii="Calibri" w:eastAsia="Calibri" w:hAnsi="Calibri" w:cs="Calibri"/>
+              </w:rPr>
+              <w:t>GET /audit</w:t>
+            </w:r>
+          </w:p>
+        </w:tc>
+        <w:tc>
+          <w:tcPr>
+            <w:tcW w:w="4600" w:type="dxa"/>
+          </w:tcPr>
+          <w:p>
+            <w:r>
+              <w:rPr>
+                <w:rFonts w:ascii="Calibri" w:eastAsia="Calibri" w:hAnsi="Calibri" w:cs="Calibri"/>
+              </w:rPr>
+              <w:t>Browse the audit trail, newest first, filtered by date range and account; read-only</w:t>
             </w:r>
           </w:p>
         </w:tc>
@@ -3249,7 +3696,7 @@
         <w:rPr>
           <w:rFonts w:ascii="Calibri" w:eastAsia="Calibri" w:hAnsi="Calibri" w:cs="Calibri"/>
         </w:rPr>
-        <w:t>Concurrency conflicts (e.g., two operations on the same account) are handled via row-level locking at the database layer; a losing transaction is retried or rejected with a clear message rather than silently overwriting data.</w:t>
+        <w:t>Concurrency conflicts (e.g., two operations on the same account) are handled by the database write lock. The chosen RDBMS, SQLite (ADR 001), has no row-level locking, so every balance-changing operation starts with BEGIN IMMEDIATE and writes run one at a time; the second request then reads the updated balance and either succeeds or is rejected with a clear message, and no update is lost. The row locks drawn in Figures 2 and 3 are realised by this database-wide lock. Record-level locking is future work (SRS Appendix D); see the deviations log.</w:t>
       </w:r>
     </w:p>
     <w:tbl>
@@ -3514,7 +3961,7 @@
               <w:rPr>
                 <w:rFonts w:ascii="Calibri" w:eastAsia="Calibri" w:hAnsi="Calibri" w:cs="Calibri"/>
               </w:rPr>
-              <w:t>Row-level lock serializes operations; second request processed against updated balance or rejected if now invalid</w:t>
+              <w:t>Database write lock serializes operations; second request processed against updated balance or rejected if now invalid</w:t>
             </w:r>
           </w:p>
         </w:tc>
@@ -3650,6 +4097,78 @@
           <w:rFonts w:ascii="Calibri" w:eastAsia="Calibri" w:hAnsi="Calibri" w:cs="Calibri"/>
         </w:rPr>
         <w:t>) Transaction. Referential integrity constraints (foreign keys) enforce these relationships, and database-level transactions provide the atomicity guarantees required by NFR-3. Full attribute lists, primary/foreign keys, and cardinalities are maintained in the project repository's design/ directory, consistent with SRS Appendix B.</w:t>
+      </w:r>
+    </w:p>
+    <w:p>
+      <w:pPr>
+        <w:spacing w:after="120"/>
+      </w:pPr>
+      <w:r>
+        <w:t xml:space="preserve">The entity-relationship diagram of the implemented schema is Figure 4 and is kept in the repository as </w:t>
+      </w:r>
+      <w:hyperlink r:id="rId10">
+        <w:r>
+          <w:rPr>
+            <w:u w:val="single"/>
+            <w:color w:val="0563C1"/>
+          </w:rPr>
+          <w:t>design/er-diagram.png</w:t>
+        </w:r>
+      </w:hyperlink>
+      <w:r>
+        <w:t xml:space="preserve"> (Mermaid source design/er-diagram.mmd, SVG design/er-diagram.svg). It adds the users table (role, status, failed-attempt count), the append-only audit_log table, the interest_runs table and the account type parameters to the entities listed above; audit_log and transactions are made append-only by database triggers.</w:t>
+      </w:r>
+    </w:p>
+    <w:p>
+      <w:pPr>
+        <w:spacing w:after="200"/>
+        <w:jc w:val="center"/>
+      </w:pPr>
+      <w:r>
+        <w:drawing>
+          <wp:inline xmlns:a="http://schemas.openxmlformats.org/drawingml/2006/main" xmlns:pic="http://schemas.openxmlformats.org/drawingml/2006/picture">
+            <wp:extent cx="2509721" cy="5669280"/>
+            <wp:docPr id="2020846634" name="Picture 2020846634"/>
+            <wp:cNvGraphicFramePr>
+              <a:graphicFrameLocks noChangeAspect="1"/>
+            </wp:cNvGraphicFramePr>
+            <a:graphic>
+              <a:graphicData uri="http://schemas.openxmlformats.org/drawingml/2006/picture">
+                <pic:pic>
+                  <pic:nvPicPr>
+                    <pic:cNvPr id="0" name="er-diagram.png"/>
+                    <pic:cNvPicPr/>
+                  </pic:nvPicPr>
+                  <pic:blipFill>
+                    <a:blip r:embed="rId11"/>
+                    <a:stretch>
+                      <a:fillRect/>
+                    </a:stretch>
+                  </pic:blipFill>
+                  <pic:spPr>
+                    <a:xfrm>
+                      <a:off x="0" y="0"/>
+                      <a:ext cx="2509721" cy="5669280"/>
+                    </a:xfrm>
+                    <a:prstGeom prst="rect"/>
+                  </pic:spPr>
+                </pic:pic>
+              </a:graphicData>
+            </a:graphic>
+          </wp:inline>
+        </w:drawing>
+      </w:r>
+    </w:p>
+    <w:p>
+      <w:pPr>
+        <w:spacing w:after="300"/>
+        <w:jc w:val="center"/>
+      </w:pPr>
+      <w:r>
+        <w:rPr>
+          <w:i/>
+        </w:rPr>
+        <w:t>Figure 4: Entity-Relationship Diagram — Bank Management System database</w:t>
       </w:r>
     </w:p>
     <w:p>

</xml_diff>